<commit_message>
bug en el ajuste de numeros en las tallas, si funciona pero apenas lo corregiremos
</commit_message>
<xml_diff>
--- a/docs/RMC_NIKE_PANEL_MANUAL_OPERACION_v1.0.docx
+++ b/docs/RMC_NIKE_PANEL_MANUAL_OPERACION_v1.0.docx
@@ -64,8 +64,8 @@
         </w:tblBorders>
       </w:tblPr>
       <w:tblGrid>
-        <w:gridCol w:w="4680"/>
-        <w:gridCol w:w="4680"/>
+        <w:gridCol w:w="2200"/>
+        <w:gridCol w:w="7160"/>
       </w:tblGrid>
       <w:tr>
         <w:trPr>
@@ -329,7 +329,9 @@
                 <w:color w:val="191919"/>
                 <w:sz w:val="18"/>
               </w:rPr>
-              <w:t>com.rmc.nike.panel.main</w:t>
+              <w:t>com.rmc.nike.panel.</w:t>
+              <w:br/>
+              <w:t>main</w:t>
             </w:r>
           </w:p>
         </w:tc>
@@ -396,6 +398,7 @@
       <w:tblPr>
         <w:tblW w:type="dxa" w:w="9360"/>
         <w:tblLook w:firstColumn="1" w:firstRow="1" w:lastColumn="0" w:lastRow="0" w:noHBand="0" w:noVBand="1" w:val="04A0"/>
+        <w:tblLayout w:type="fixed"/>
         <w:tblInd w:w="120" w:type="dxa"/>
         <w:tblBorders>
           <w:top w:val="single" w:sz="4" w:space="0" w:color="D9E2F3"/>
@@ -502,9 +505,9 @@
         </w:tblBorders>
       </w:tblPr>
       <w:tblGrid>
-        <w:gridCol w:w="3120"/>
-        <w:gridCol w:w="3120"/>
-        <w:gridCol w:w="3120"/>
+        <w:gridCol w:w="1800"/>
+        <w:gridCol w:w="3600"/>
+        <w:gridCol w:w="3960"/>
       </w:tblGrid>
       <w:tr>
         <w:trPr>
@@ -1133,9 +1136,9 @@
         </w:tblBorders>
       </w:tblPr>
       <w:tblGrid>
-        <w:gridCol w:w="3120"/>
-        <w:gridCol w:w="3120"/>
-        <w:gridCol w:w="3120"/>
+        <w:gridCol w:w="1200"/>
+        <w:gridCol w:w="4680"/>
+        <w:gridCol w:w="3480"/>
       </w:tblGrid>
       <w:tr>
         <w:trPr>
@@ -1387,6 +1390,7 @@
       <w:tblPr>
         <w:tblW w:type="dxa" w:w="9360"/>
         <w:tblLook w:firstColumn="1" w:firstRow="1" w:lastColumn="0" w:lastRow="0" w:noHBand="0" w:noVBand="1" w:val="04A0"/>
+        <w:tblLayout w:type="fixed"/>
         <w:tblInd w:w="120" w:type="dxa"/>
         <w:tblBorders>
           <w:top w:val="single" w:sz="4" w:space="0" w:color="D9E2F3"/>
@@ -1597,9 +1601,9 @@
         </w:tblBorders>
       </w:tblPr>
       <w:tblGrid>
-        <w:gridCol w:w="3120"/>
-        <w:gridCol w:w="3120"/>
-        <w:gridCol w:w="3120"/>
+        <w:gridCol w:w="1300"/>
+        <w:gridCol w:w="3300"/>
+        <w:gridCol w:w="4760"/>
       </w:tblGrid>
       <w:tr>
         <w:trPr>
@@ -2509,9 +2513,9 @@
         </w:tblBorders>
       </w:tblPr>
       <w:tblGrid>
-        <w:gridCol w:w="3120"/>
-        <w:gridCol w:w="3120"/>
-        <w:gridCol w:w="3120"/>
+        <w:gridCol w:w="1800"/>
+        <w:gridCol w:w="4600"/>
+        <w:gridCol w:w="2960"/>
       </w:tblGrid>
       <w:tr>
         <w:trPr>
@@ -2884,6 +2888,7 @@
       <w:tblPr>
         <w:tblW w:type="dxa" w:w="9360"/>
         <w:tblLook w:firstColumn="1" w:firstRow="1" w:lastColumn="0" w:lastRow="0" w:noHBand="0" w:noVBand="1" w:val="04A0"/>
+        <w:tblLayout w:type="fixed"/>
         <w:tblInd w:w="120" w:type="dxa"/>
         <w:tblBorders>
           <w:top w:val="single" w:sz="4" w:space="0" w:color="D9E2F3"/>
@@ -2961,9 +2966,9 @@
         </w:tblBorders>
       </w:tblPr>
       <w:tblGrid>
-        <w:gridCol w:w="3120"/>
-        <w:gridCol w:w="3120"/>
-        <w:gridCol w:w="3120"/>
+        <w:gridCol w:w="1800"/>
+        <w:gridCol w:w="2200"/>
+        <w:gridCol w:w="5360"/>
       </w:tblGrid>
       <w:tr>
         <w:trPr>
@@ -3565,12 +3570,12 @@
         </w:tblBorders>
       </w:tblPr>
       <w:tblGrid>
-        <w:gridCol w:w="1560"/>
-        <w:gridCol w:w="1560"/>
-        <w:gridCol w:w="1560"/>
-        <w:gridCol w:w="1560"/>
-        <w:gridCol w:w="1560"/>
-        <w:gridCol w:w="1560"/>
+        <w:gridCol w:w="1700"/>
+        <w:gridCol w:w="900"/>
+        <w:gridCol w:w="1900"/>
+        <w:gridCol w:w="1700"/>
+        <w:gridCol w:w="900"/>
+        <w:gridCol w:w="2260"/>
       </w:tblGrid>
       <w:tr>
         <w:trPr>
@@ -4953,6 +4958,7 @@
       <w:tblPr>
         <w:tblW w:type="dxa" w:w="9360"/>
         <w:tblLook w:firstColumn="1" w:firstRow="1" w:lastColumn="0" w:lastRow="0" w:noHBand="0" w:noVBand="1" w:val="04A0"/>
+        <w:tblLayout w:type="fixed"/>
         <w:tblInd w:w="120" w:type="dxa"/>
         <w:tblBorders>
           <w:top w:val="single" w:sz="4" w:space="0" w:color="D9E2F3"/>
@@ -5059,9 +5065,9 @@
         </w:tblBorders>
       </w:tblPr>
       <w:tblGrid>
-        <w:gridCol w:w="3120"/>
-        <w:gridCol w:w="3120"/>
-        <w:gridCol w:w="3120"/>
+        <w:gridCol w:w="2100"/>
+        <w:gridCol w:w="1900"/>
+        <w:gridCol w:w="5360"/>
       </w:tblGrid>
       <w:tr>
         <w:trPr>
@@ -5601,12 +5607,12 @@
         </w:tblBorders>
       </w:tblPr>
       <w:tblGrid>
-        <w:gridCol w:w="1560"/>
-        <w:gridCol w:w="1560"/>
-        <w:gridCol w:w="1560"/>
-        <w:gridCol w:w="1560"/>
-        <w:gridCol w:w="1560"/>
-        <w:gridCol w:w="1560"/>
+        <w:gridCol w:w="1100"/>
+        <w:gridCol w:w="1650"/>
+        <w:gridCol w:w="1500"/>
+        <w:gridCol w:w="1500"/>
+        <w:gridCol w:w="2250"/>
+        <w:gridCol w:w="1960"/>
       </w:tblGrid>
       <w:tr>
         <w:trPr>
@@ -6191,9 +6197,9 @@
         </w:tblBorders>
       </w:tblPr>
       <w:tblGrid>
-        <w:gridCol w:w="3120"/>
-        <w:gridCol w:w="3120"/>
-        <w:gridCol w:w="3120"/>
+        <w:gridCol w:w="2400"/>
+        <w:gridCol w:w="4100"/>
+        <w:gridCol w:w="2860"/>
       </w:tblGrid>
       <w:tr>
         <w:trPr>
@@ -6445,6 +6451,7 @@
       <w:tblPr>
         <w:tblW w:type="dxa" w:w="9360"/>
         <w:tblLook w:firstColumn="1" w:firstRow="1" w:lastColumn="0" w:lastRow="0" w:noHBand="0" w:noVBand="1" w:val="04A0"/>
+        <w:tblLayout w:type="fixed"/>
         <w:tblInd w:w="120" w:type="dxa"/>
         <w:tblBorders>
           <w:top w:val="single" w:sz="4" w:space="0" w:color="D9E2F3"/>
@@ -6536,9 +6543,9 @@
         </w:tblBorders>
       </w:tblPr>
       <w:tblGrid>
-        <w:gridCol w:w="3120"/>
-        <w:gridCol w:w="3120"/>
-        <w:gridCol w:w="3120"/>
+        <w:gridCol w:w="2600"/>
+        <w:gridCol w:w="3600"/>
+        <w:gridCol w:w="3160"/>
       </w:tblGrid>
       <w:tr>
         <w:trPr>
@@ -7125,9 +7132,9 @@
         </w:tblBorders>
       </w:tblPr>
       <w:tblGrid>
-        <w:gridCol w:w="3120"/>
-        <w:gridCol w:w="3120"/>
-        <w:gridCol w:w="3120"/>
+        <w:gridCol w:w="2600"/>
+        <w:gridCol w:w="3100"/>
+        <w:gridCol w:w="3660"/>
       </w:tblGrid>
       <w:tr>
         <w:trPr>

</xml_diff>